<commit_message>
Updated Sprint Report 4. Only needs vSTB portions
</commit_message>
<xml_diff>
--- a/docs/srDesign_SprintReport4.docx
+++ b/docs/srDesign_SprintReport4.docx
@@ -865,133 +865,84 @@
       <w:r>
         <w:t>was the ability to use L</w:t>
       </w:r>
+      <w:r>
+        <w:t>inq to generating SQL statements, viewing the database as an object graph, meaning that the details of the data store are hidden, and being able to update our in memory definition easily as we change the definitions at the database level.</w:t>
+      </w:r>
+    </w:p>
+    <w:p>
+      <w:pPr>
+        <w:pStyle w:val="ListParagraph"/>
+        <w:numPr>
+          <w:ilvl w:val="1"/>
+          <w:numId w:val="5"/>
+        </w:numPr>
+      </w:pPr>
+      <w:r>
+        <w:t>One user story that was given was the ability to change the location, username, and password of the database within the server. This caused some confusion and clarification was needed to distinguish whether this meant at runtime or compile time, and the exact details of how it should be done to make it easiest for those maintaining the server.</w:t>
+      </w:r>
+    </w:p>
+    <w:p>
+      <w:pPr>
+        <w:pStyle w:val="ListParagraph"/>
+        <w:numPr>
+          <w:ilvl w:val="0"/>
+          <w:numId w:val="5"/>
+        </w:numPr>
+      </w:pPr>
+      <w:r>
+        <w:t>Serialization</w:t>
+      </w:r>
+    </w:p>
+    <w:p>
+      <w:pPr>
+        <w:pStyle w:val="ListParagraph"/>
+        <w:numPr>
+          <w:ilvl w:val="1"/>
+          <w:numId w:val="5"/>
+        </w:numPr>
+      </w:pPr>
+      <w:r>
+        <w:t xml:space="preserve">Some classes are serializable, meaning that we can turn an object into a byte array and store it somewhere with little coding effort. </w:t>
+      </w:r>
+      <w:r>
+        <w:t xml:space="preserve">In a first attempt to serialize some objects, we found that the .NET serializer created unnecessarily large byte arrays. After some discussion, we decided to use Google’s open source serialization method, called Protocol Buffers. We observed that same object we had previously serialized using .NET used about half the memory when serialized under Protocol Buffers. </w:t>
+      </w:r>
+    </w:p>
+    <w:p>
+      <w:pPr>
+        <w:pStyle w:val="Heading1"/>
+      </w:pPr>
+      <w:r>
+        <w:t>Next Sprint</w:t>
+      </w:r>
+    </w:p>
+    <w:p>
+      <w:pPr>
+        <w:pStyle w:val="Heading2"/>
+      </w:pPr>
+      <w:r>
+        <w:t>Virtual Set Top Box</w:t>
+      </w:r>
+    </w:p>
+    <w:p>
+      <w:r>
+        <w:t>TODO</w:t>
+      </w:r>
+    </w:p>
+    <w:p>
+      <w:pPr>
+        <w:pStyle w:val="Heading2"/>
+      </w:pPr>
+      <w:r>
+        <w:t>Server</w:t>
+      </w:r>
+    </w:p>
+    <w:p>
+      <w:r>
+        <w:t xml:space="preserve">In the next sprint, we will finish up the bare bones of the server so that it can be run as a service. There is work to be done in terms of messaging yet. We need to split large messages into multiple messages. This is to accommodate the UDP message passing between the APMax and STBs. We will also begin implementing the logic of checkers. After we have the logic in place, we can begin work on the artificial intelligence aspect of checkers. </w:t>
+      </w:r>
       <w:bookmarkStart w:id="0" w:name="_GoBack"/>
       <w:bookmarkEnd w:id="0"/>
-      <w:r>
-        <w:t>inq to generating SQL statements, viewing the database as an object graph, meaning that the details of the data store are hidden, and being able to update our in memory definition easily as we change the definitions at the database level.</w:t>
-      </w:r>
-    </w:p>
-    <w:p>
-      <w:pPr>
-        <w:pStyle w:val="ListParagraph"/>
-        <w:numPr>
-          <w:ilvl w:val="1"/>
-          <w:numId w:val="5"/>
-        </w:numPr>
-      </w:pPr>
-      <w:r>
-        <w:t>One user story that was given was the ability to change the location, username, and password of the database within the server. This caused some confusion and clarification was needed to distinguish whether this meant at runtime or compile time, and the exact details of how it should be done to make it easiest for those maintaining the server.</w:t>
-      </w:r>
-    </w:p>
-    <w:p>
-      <w:pPr>
-        <w:pStyle w:val="ListParagraph"/>
-        <w:numPr>
-          <w:ilvl w:val="0"/>
-          <w:numId w:val="5"/>
-        </w:numPr>
-      </w:pPr>
-    </w:p>
-    <w:p>
-      <w:r>
-        <w:br w:type="page"/>
-      </w:r>
-    </w:p>
-    <w:p/>
-    <w:p>
-      <w:r>
-        <w:t>Research done</w:t>
-      </w:r>
-    </w:p>
-    <w:p>
-      <w:pPr>
-        <w:ind w:left="720"/>
-      </w:pPr>
-      <w:r>
-        <w:t>Using reflection to retrieve resources and call methods from a dll that was not compiled into the project.</w:t>
-      </w:r>
-    </w:p>
-    <w:p>
-      <w:pPr>
-        <w:ind w:left="720"/>
-      </w:pPr>
-      <w:r>
-        <w:t>Research attaching GUI to server (named pipes)</w:t>
-      </w:r>
-    </w:p>
-    <w:p>
-      <w:pPr>
-        <w:ind w:left="720"/>
-      </w:pPr>
-      <w:r>
-        <w:t>Doxygen to compile xml comments into documentation</w:t>
-      </w:r>
-    </w:p>
-    <w:p>
-      <w:r>
-        <w:t>Work (cards) carried to next sprint</w:t>
-      </w:r>
-    </w:p>
-    <w:p>
-      <w:pPr>
-        <w:ind w:left="720"/>
-      </w:pPr>
-      <w:r>
-        <w:t>Testing</w:t>
-      </w:r>
-    </w:p>
-    <w:p>
-      <w:pPr>
-        <w:ind w:left="720"/>
-      </w:pPr>
-      <w:r>
-        <w:t>Demo creation</w:t>
-      </w:r>
-    </w:p>
-    <w:p>
-      <w:r>
-        <w:t>Upcoming Cards</w:t>
-      </w:r>
-    </w:p>
-    <w:p>
-      <w:pPr>
-        <w:ind w:left="720"/>
-      </w:pPr>
-      <w:r>
-        <w:t>Review coding standards/refactor server into compliance</w:t>
-      </w:r>
-    </w:p>
-    <w:p>
-      <w:pPr>
-        <w:ind w:left="720"/>
-      </w:pPr>
-      <w:r>
-        <w:t>Build gui – connect to server</w:t>
-      </w:r>
-    </w:p>
-    <w:p>
-      <w:pPr>
-        <w:ind w:left="720"/>
-      </w:pPr>
-      <w:r>
-        <w:t>Polish the plugin interface</w:t>
-      </w:r>
-    </w:p>
-    <w:p>
-      <w:pPr>
-        <w:ind w:left="720"/>
-      </w:pPr>
-      <w:r>
-        <w:t>Break up large messages into multiple packets</w:t>
-      </w:r>
-    </w:p>
-    <w:p>
-      <w:pPr>
-        <w:ind w:left="720"/>
-      </w:pPr>
-      <w:r>
-        <w:t>Compile 2 game states into a new update state</w:t>
-      </w:r>
     </w:p>
     <w:sectPr>
       <w:pgSz w:w="12240" w:h="15840"/>

</xml_diff>

<commit_message>
sprint 4 report update with vstb info
</commit_message>
<xml_diff>
--- a/docs/srDesign_SprintReport4.docx
+++ b/docs/srDesign_SprintReport4.docx
@@ -74,7 +74,15 @@
     </w:p>
     <w:p>
       <w:r>
-        <w:t>This sprint was split between the Game Server and the Virtual Set Top Box. Team member Kevin and David worked on the server while Marshall worked on the vSTB.</w:t>
+        <w:t xml:space="preserve">This sprint was split between the Game Server and the Virtual Set Top Box. Team member Kevin and David worked on the server while Marshall worked on the </w:t>
+      </w:r>
+      <w:proofErr w:type="spellStart"/>
+      <w:r>
+        <w:t>vSTB</w:t>
+      </w:r>
+      <w:proofErr w:type="spellEnd"/>
+      <w:r>
+        <w:t>.</w:t>
       </w:r>
       <w:r>
         <w:t xml:space="preserve"> During the sprint planning meeting, several goals and expectations were set: A demo to show Roger, unit and regression testing discussion, and to have a code re</w:t>
@@ -100,7 +108,15 @@
         </w:numPr>
       </w:pPr>
       <w:r>
-        <w:t>Forward CommandLink message to proper game instance</w:t>
+        <w:t xml:space="preserve">Forward </w:t>
+      </w:r>
+      <w:proofErr w:type="spellStart"/>
+      <w:r>
+        <w:t>CommandLink</w:t>
+      </w:r>
+      <w:proofErr w:type="spellEnd"/>
+      <w:r>
+        <w:t xml:space="preserve"> message to proper game instance</w:t>
       </w:r>
     </w:p>
     <w:p>
@@ -160,31 +176,55 @@
         </w:numPr>
       </w:pPr>
       <w:r>
-        <w:t>Move all networking aspects out of MPGameServer project and into the communication project</w:t>
-      </w:r>
-    </w:p>
-    <w:p>
-      <w:pPr>
-        <w:pStyle w:val="ListParagraph"/>
-        <w:numPr>
-          <w:ilvl w:val="1"/>
-          <w:numId w:val="3"/>
-        </w:numPr>
-      </w:pPr>
-      <w:r>
-        <w:t>Transfer data manipulation methods from DataHandler to Utility</w:t>
-      </w:r>
-    </w:p>
-    <w:p>
-      <w:pPr>
-        <w:pStyle w:val="ListParagraph"/>
-        <w:numPr>
-          <w:ilvl w:val="1"/>
-          <w:numId w:val="3"/>
-        </w:numPr>
-      </w:pPr>
-      <w:r>
-        <w:t>Restructure ConnectionManager (GUI)</w:t>
+        <w:t xml:space="preserve">Move all networking aspects out of </w:t>
+      </w:r>
+      <w:proofErr w:type="spellStart"/>
+      <w:r>
+        <w:t>MPGameServer</w:t>
+      </w:r>
+      <w:proofErr w:type="spellEnd"/>
+      <w:r>
+        <w:t xml:space="preserve"> project and into the communication project</w:t>
+      </w:r>
+    </w:p>
+    <w:p>
+      <w:pPr>
+        <w:pStyle w:val="ListParagraph"/>
+        <w:numPr>
+          <w:ilvl w:val="1"/>
+          <w:numId w:val="3"/>
+        </w:numPr>
+      </w:pPr>
+      <w:r>
+        <w:t xml:space="preserve">Transfer data manipulation methods from </w:t>
+      </w:r>
+      <w:proofErr w:type="spellStart"/>
+      <w:r>
+        <w:t>DataHandler</w:t>
+      </w:r>
+      <w:proofErr w:type="spellEnd"/>
+      <w:r>
+        <w:t xml:space="preserve"> to Utility</w:t>
+      </w:r>
+    </w:p>
+    <w:p>
+      <w:pPr>
+        <w:pStyle w:val="ListParagraph"/>
+        <w:numPr>
+          <w:ilvl w:val="1"/>
+          <w:numId w:val="3"/>
+        </w:numPr>
+      </w:pPr>
+      <w:r>
+        <w:t xml:space="preserve">Restructure </w:t>
+      </w:r>
+      <w:proofErr w:type="spellStart"/>
+      <w:r>
+        <w:t>ConnectionManager</w:t>
+      </w:r>
+      <w:proofErr w:type="spellEnd"/>
+      <w:r>
+        <w:t xml:space="preserve"> (GUI)</w:t>
       </w:r>
     </w:p>
     <w:p>
@@ -220,8 +260,13 @@
         </w:numPr>
       </w:pPr>
       <w:r>
-        <w:t>Parse message on vSTB</w:t>
-      </w:r>
+        <w:t xml:space="preserve">Parse message on </w:t>
+      </w:r>
+      <w:proofErr w:type="spellStart"/>
+      <w:r>
+        <w:t>vSTB</w:t>
+      </w:r>
+      <w:proofErr w:type="spellEnd"/>
     </w:p>
     <w:p>
       <w:pPr>
@@ -340,7 +385,15 @@
         </w:numPr>
       </w:pPr>
       <w:r>
-        <w:t>Create serializable class to hold full game states</w:t>
+        <w:t xml:space="preserve">Create </w:t>
+      </w:r>
+      <w:proofErr w:type="spellStart"/>
+      <w:r>
+        <w:t>serializable</w:t>
+      </w:r>
+      <w:proofErr w:type="spellEnd"/>
+      <w:r>
+        <w:t xml:space="preserve"> class to hold full game states</w:t>
       </w:r>
     </w:p>
     <w:p>
@@ -565,7 +618,23 @@
         </w:numPr>
       </w:pPr>
       <w:r>
-        <w:t>Connect vSTB to vAPMax echo stubbed response app</w:t>
+        <w:t xml:space="preserve">Connect </w:t>
+      </w:r>
+      <w:proofErr w:type="spellStart"/>
+      <w:r>
+        <w:t>vSTB</w:t>
+      </w:r>
+      <w:proofErr w:type="spellEnd"/>
+      <w:r>
+        <w:t xml:space="preserve"> to </w:t>
+      </w:r>
+      <w:proofErr w:type="spellStart"/>
+      <w:r>
+        <w:t>vAPMax</w:t>
+      </w:r>
+      <w:proofErr w:type="spellEnd"/>
+      <w:r>
+        <w:t xml:space="preserve"> echo stubbed response app</w:t>
       </w:r>
     </w:p>
     <w:p>
@@ -625,7 +694,15 @@
         </w:numPr>
       </w:pPr>
       <w:r>
-        <w:t>User mode will allow selection of new game or previous game from resource files to load vSTB game not raw data file</w:t>
+        <w:t xml:space="preserve">User mode will allow selection of new game or previous game from resource files to load </w:t>
+      </w:r>
+      <w:proofErr w:type="spellStart"/>
+      <w:r>
+        <w:t>vSTB</w:t>
+      </w:r>
+      <w:proofErr w:type="spellEnd"/>
+      <w:r>
+        <w:t xml:space="preserve"> game not raw data file</w:t>
       </w:r>
     </w:p>
     <w:p>
@@ -708,8 +785,13 @@
           <w:numId w:val="4"/>
         </w:numPr>
       </w:pPr>
-      <w:r>
-        <w:t>Wireshark dissector research</w:t>
+      <w:proofErr w:type="spellStart"/>
+      <w:r>
+        <w:t>Wireshark</w:t>
+      </w:r>
+      <w:proofErr w:type="spellEnd"/>
+      <w:r>
+        <w:t xml:space="preserve"> dissector research</w:t>
       </w:r>
     </w:p>
     <w:p>
@@ -721,8 +803,13 @@
         </w:numPr>
       </w:pPr>
       <w:r>
-        <w:t>Prove out and implement QUiLoader</w:t>
-      </w:r>
+        <w:t xml:space="preserve">Prove out and implement </w:t>
+      </w:r>
+      <w:proofErr w:type="spellStart"/>
+      <w:r>
+        <w:t>QUiLoader</w:t>
+      </w:r>
+      <w:proofErr w:type="spellEnd"/>
     </w:p>
     <w:p>
       <w:pPr>
@@ -744,8 +831,13 @@
           <w:numId w:val="4"/>
         </w:numPr>
       </w:pPr>
-      <w:r>
-        <w:t>vAPMax stubbed message app</w:t>
+      <w:proofErr w:type="spellStart"/>
+      <w:r>
+        <w:t>vAPMax</w:t>
+      </w:r>
+      <w:proofErr w:type="spellEnd"/>
+      <w:r>
+        <w:t xml:space="preserve"> stubbed message app</w:t>
       </w:r>
     </w:p>
     <w:p>
@@ -768,9 +860,11 @@
           <w:numId w:val="4"/>
         </w:numPr>
       </w:pPr>
+      <w:proofErr w:type="spellStart"/>
       <w:r>
         <w:t>FileSystemWatcher</w:t>
       </w:r>
+      <w:proofErr w:type="spellEnd"/>
     </w:p>
     <w:p>
       <w:pPr>
@@ -790,41 +884,72 @@
     </w:p>
     <w:p>
       <w:r>
-        <w:t>TODO</w:t>
-      </w:r>
-    </w:p>
-    <w:p>
-      <w:pPr>
-        <w:pStyle w:val="Heading2"/>
-      </w:pPr>
-      <w:r>
-        <w:t>Server</w:t>
-      </w:r>
-    </w:p>
-    <w:p>
-      <w:r>
-        <w:t>All server related tasks were completed this sprint allowing us to focus on the rest of the project in following sprints, including implementing Checkers logic, Checkers A.I., unit testing, and creating an user interface to add games.</w:t>
-      </w:r>
-    </w:p>
-    <w:p>
-      <w:pPr>
-        <w:pStyle w:val="Heading1"/>
-      </w:pPr>
-      <w:r>
-        <w:t>Issues</w:t>
-      </w:r>
-    </w:p>
-    <w:p>
-      <w:pPr>
-        <w:pStyle w:val="Heading2"/>
-      </w:pPr>
-      <w:r>
-        <w:t>Virtual Set Top Box</w:t>
-      </w:r>
-    </w:p>
-    <w:p>
-      <w:r>
-        <w:t>TODO</w:t>
+        <w:t xml:space="preserve">All the main classes that make up the </w:t>
+      </w:r>
+      <w:proofErr w:type="spellStart"/>
+      <w:r>
+        <w:t>vstb</w:t>
+      </w:r>
+      <w:proofErr w:type="spellEnd"/>
+      <w:r>
+        <w:t xml:space="preserve"> multiplayer environment were completed this sprint. This provides the framework to refactor the classes as determined by communication of live environment. The </w:t>
+      </w:r>
+      <w:proofErr w:type="spellStart"/>
+      <w:r>
+        <w:t>Gameview</w:t>
+      </w:r>
+      <w:proofErr w:type="spellEnd"/>
+      <w:r>
+        <w:t xml:space="preserve"> class needs to be slightly modify to essentially mimic the movements of a </w:t>
+      </w:r>
+      <w:proofErr w:type="spellStart"/>
+      <w:r>
+        <w:t>stb</w:t>
+      </w:r>
+      <w:proofErr w:type="spellEnd"/>
+      <w:r>
+        <w:t xml:space="preserve"> remote so I have designed a simple remote to emit the signals(e.g. </w:t>
+      </w:r>
+      <w:proofErr w:type="spellStart"/>
+      <w:r>
+        <w:t>up,down,left,right,menu,info</w:t>
+      </w:r>
+      <w:proofErr w:type="spellEnd"/>
+      <w:r>
+        <w:t>) to the view.  T</w:t>
+      </w:r>
+      <w:r>
+        <w:t>he communication layer needs additional message handling logic</w:t>
+      </w:r>
+      <w:r>
+        <w:t xml:space="preserve"> to handle larger UDP messages</w:t>
+      </w:r>
+      <w:r>
+        <w:t xml:space="preserve"> (game resource files) sent down the wire. Until we can validate the integrity of a game resource file, I will simply modify the </w:t>
+      </w:r>
+      <w:proofErr w:type="spellStart"/>
+      <w:r>
+        <w:t>Gameview</w:t>
+      </w:r>
+      <w:proofErr w:type="spellEnd"/>
+      <w:r>
+        <w:t xml:space="preserve">, </w:t>
+      </w:r>
+      <w:proofErr w:type="spellStart"/>
+      <w:r>
+        <w:t>Gamemodel</w:t>
+      </w:r>
+      <w:proofErr w:type="spellEnd"/>
+      <w:r>
+        <w:t xml:space="preserve">, and </w:t>
+      </w:r>
+      <w:proofErr w:type="spellStart"/>
+      <w:r>
+        <w:t>Gamepiece</w:t>
+      </w:r>
+      <w:proofErr w:type="spellEnd"/>
+      <w:r>
+        <w:t xml:space="preserve"> class to read from local game resource files that are valid.  This provides a point of reference for how the GUI should behave and look when the communication layer is stable.</w:t>
       </w:r>
     </w:p>
     <w:p>
@@ -837,6 +962,304 @@
       </w:r>
     </w:p>
     <w:p>
+      <w:r>
+        <w:t>All server related tasks were completed this sprint allowing us to focus on the rest of the project in following sprints, including implementing Checkers logic, Checkers A.I., unit testing, and creating an user interface to add games.</w:t>
+      </w:r>
+    </w:p>
+    <w:p>
+      <w:pPr>
+        <w:pStyle w:val="Heading1"/>
+      </w:pPr>
+      <w:r>
+        <w:t>Issues</w:t>
+      </w:r>
+    </w:p>
+    <w:p>
+      <w:pPr>
+        <w:pStyle w:val="Heading2"/>
+      </w:pPr>
+      <w:r>
+        <w:t>Virtual Set Top Box</w:t>
+      </w:r>
+    </w:p>
+    <w:p>
+      <w:pPr>
+        <w:pStyle w:val="ListParagraph"/>
+        <w:numPr>
+          <w:ilvl w:val="0"/>
+          <w:numId w:val="7"/>
+        </w:numPr>
+      </w:pPr>
+      <w:proofErr w:type="spellStart"/>
+      <w:r>
+        <w:t>Gameview</w:t>
+      </w:r>
+      <w:proofErr w:type="spellEnd"/>
+      <w:r>
+        <w:t xml:space="preserve">/ </w:t>
+      </w:r>
+      <w:proofErr w:type="spellStart"/>
+      <w:r>
+        <w:t>Gamemodel</w:t>
+      </w:r>
+      <w:proofErr w:type="spellEnd"/>
+      <w:r>
+        <w:t xml:space="preserve"> / </w:t>
+      </w:r>
+      <w:proofErr w:type="spellStart"/>
+      <w:r>
+        <w:t>Gamepiece</w:t>
+      </w:r>
+      <w:proofErr w:type="spellEnd"/>
+    </w:p>
+    <w:p>
+      <w:pPr>
+        <w:pStyle w:val="ListParagraph"/>
+        <w:numPr>
+          <w:ilvl w:val="1"/>
+          <w:numId w:val="7"/>
+        </w:numPr>
+      </w:pPr>
+      <w:r>
+        <w:t>GUI or NUI</w:t>
+      </w:r>
+    </w:p>
+    <w:p>
+      <w:pPr>
+        <w:pStyle w:val="ListParagraph"/>
+        <w:ind w:left="792"/>
+      </w:pPr>
+      <w:proofErr w:type="gramStart"/>
+      <w:r>
+        <w:t xml:space="preserve">The user’s interaction with the </w:t>
+      </w:r>
+      <w:proofErr w:type="spellStart"/>
+      <w:r>
+        <w:t>v</w:t>
+      </w:r>
+      <w:r>
+        <w:t>STB</w:t>
+      </w:r>
+      <w:proofErr w:type="spellEnd"/>
+      <w:r>
+        <w:t xml:space="preserve"> app.</w:t>
+      </w:r>
+      <w:proofErr w:type="gramEnd"/>
+      <w:r>
+        <w:t xml:space="preserve"> There needs to be a clear distinction if it is a GUI or a NUI for our proof of concept environment, as the movement logic is simplified drastically in a NUI</w:t>
+      </w:r>
+      <w:r>
+        <w:t xml:space="preserve">. The NUI </w:t>
+      </w:r>
+      <w:proofErr w:type="spellStart"/>
+      <w:r>
+        <w:t>v</w:t>
+      </w:r>
+      <w:r>
+        <w:t>STB</w:t>
+      </w:r>
+      <w:proofErr w:type="spellEnd"/>
+      <w:r>
+        <w:t xml:space="preserve"> </w:t>
+      </w:r>
+      <w:r>
+        <w:t>mimics a touch screen device</w:t>
+      </w:r>
+      <w:r>
+        <w:t xml:space="preserve"> where the user naturally interacts with the app</w:t>
+      </w:r>
+      <w:r>
+        <w:t>.</w:t>
+      </w:r>
+      <w:r>
+        <w:t xml:space="preserve"> </w:t>
+      </w:r>
+      <w:proofErr w:type="gramStart"/>
+      <w:r>
+        <w:t>Additionally</w:t>
+      </w:r>
+      <w:proofErr w:type="gramEnd"/>
+      <w:r>
+        <w:t>, there is no need design special logic to handle board games and card games because the movement it is handled by the NUI and it only cares about user</w:t>
+      </w:r>
+      <w:r>
+        <w:t>’</w:t>
+      </w:r>
+      <w:r>
+        <w:t xml:space="preserve">s selection. Creating a GUI to fudge movement across all game models creates a poor user interface that </w:t>
+      </w:r>
+      <w:r>
+        <w:t xml:space="preserve">ultimately </w:t>
+      </w:r>
+      <w:r>
+        <w:t xml:space="preserve">isn’t </w:t>
+      </w:r>
+      <w:r>
+        <w:t xml:space="preserve">consistent. The lack of consistency reduces the scalability and modularity of the </w:t>
+      </w:r>
+      <w:proofErr w:type="spellStart"/>
+      <w:r>
+        <w:t>v</w:t>
+      </w:r>
+      <w:r>
+        <w:t>STB</w:t>
+      </w:r>
+      <w:proofErr w:type="spellEnd"/>
+      <w:r>
+        <w:t xml:space="preserve"> multiplayer environment since there has to be special movement logic designed per game type. Adding a </w:t>
+      </w:r>
+      <w:proofErr w:type="spellStart"/>
+      <w:r>
+        <w:t>v</w:t>
+      </w:r>
+      <w:r>
+        <w:t>STB</w:t>
+      </w:r>
+      <w:proofErr w:type="spellEnd"/>
+      <w:r>
+        <w:t xml:space="preserve"> remote to the interface reduces the overall screen real estate of a game app and reduces the simplicity of the user’s interface. </w:t>
+      </w:r>
+    </w:p>
+    <w:p>
+      <w:pPr>
+        <w:pStyle w:val="ListParagraph"/>
+        <w:numPr>
+          <w:ilvl w:val="1"/>
+          <w:numId w:val="7"/>
+        </w:numPr>
+      </w:pPr>
+      <w:r>
+        <w:t>Timeline of Implementation</w:t>
+      </w:r>
+    </w:p>
+    <w:p>
+      <w:pPr>
+        <w:pStyle w:val="ListParagraph"/>
+        <w:ind w:left="792"/>
+      </w:pPr>
+      <w:r>
+        <w:t xml:space="preserve">Since our project is a proof of concept there needs to be clear </w:t>
+      </w:r>
+      <w:r>
+        <w:t xml:space="preserve">vision for the ultimate </w:t>
+      </w:r>
+      <w:r>
+        <w:t xml:space="preserve">purpose of this project. The reason is because current </w:t>
+      </w:r>
+      <w:r>
+        <w:t>STB</w:t>
+      </w:r>
+      <w:r>
+        <w:t xml:space="preserve">, </w:t>
+      </w:r>
+      <w:proofErr w:type="spellStart"/>
+      <w:r>
+        <w:t>apmax</w:t>
+      </w:r>
+      <w:proofErr w:type="spellEnd"/>
+      <w:r>
+        <w:t xml:space="preserve">, and server do not support our communication logic. The underlying goal of this project is to prove bidirectional communication across the entire </w:t>
+      </w:r>
+      <w:proofErr w:type="spellStart"/>
+      <w:r>
+        <w:t>iptv</w:t>
+      </w:r>
+      <w:proofErr w:type="spellEnd"/>
+      <w:r>
+        <w:t xml:space="preserve"> system within the scope of </w:t>
+      </w:r>
+      <w:r>
+        <w:t>STB</w:t>
+      </w:r>
+      <w:r>
+        <w:t xml:space="preserve"> games, since the current </w:t>
+      </w:r>
+      <w:proofErr w:type="spellStart"/>
+      <w:r>
+        <w:t>iptv</w:t>
+      </w:r>
+      <w:proofErr w:type="spellEnd"/>
+      <w:r>
+        <w:t xml:space="preserve"> architecture is limited in this respect. Designing a proof of concept to a system that needs to be redesigned to actually handle this communication doesn’t make sense. </w:t>
+      </w:r>
+      <w:r>
+        <w:t xml:space="preserve"> More importantly if this project were to go into production, the raw time required to implement it across existing network components would age the </w:t>
+      </w:r>
+      <w:proofErr w:type="spellStart"/>
+      <w:r>
+        <w:t>v</w:t>
+      </w:r>
+      <w:r>
+        <w:t>STB</w:t>
+      </w:r>
+      <w:proofErr w:type="spellEnd"/>
+      <w:r>
+        <w:t xml:space="preserve"> system</w:t>
+      </w:r>
+      <w:r>
+        <w:t>; ultimately reducing the scalability and modularity of this project.</w:t>
+      </w:r>
+    </w:p>
+    <w:p>
+      <w:pPr>
+        <w:pStyle w:val="ListParagraph"/>
+        <w:numPr>
+          <w:ilvl w:val="1"/>
+          <w:numId w:val="7"/>
+        </w:numPr>
+      </w:pPr>
+      <w:r>
+        <w:t>STB Hardware Evolution</w:t>
+      </w:r>
+    </w:p>
+    <w:p>
+      <w:pPr>
+        <w:pStyle w:val="ListParagraph"/>
+        <w:ind w:left="792"/>
+      </w:pPr>
+      <w:r>
+        <w:t xml:space="preserve">There needs to be a step back approach to the overall vision of this project as current </w:t>
+      </w:r>
+      <w:r>
+        <w:t>STB</w:t>
+      </w:r>
+      <w:r>
+        <w:t xml:space="preserve"> hardware is extremely dated. I realize from a business perspective that the </w:t>
+      </w:r>
+      <w:proofErr w:type="spellStart"/>
+      <w:r>
+        <w:t>v</w:t>
+      </w:r>
+      <w:r>
+        <w:t>STB</w:t>
+      </w:r>
+      <w:proofErr w:type="spellEnd"/>
+      <w:r>
+        <w:t xml:space="preserve"> </w:t>
+      </w:r>
+      <w:r>
+        <w:t xml:space="preserve">needs to work on all </w:t>
+      </w:r>
+      <w:r>
+        <w:t xml:space="preserve">current </w:t>
+      </w:r>
+      <w:r>
+        <w:t>STB</w:t>
+      </w:r>
+      <w:r>
+        <w:t xml:space="preserve"> AMINO products but this is a proof of concept</w:t>
+      </w:r>
+      <w:r>
+        <w:t xml:space="preserve"> and needs to remain that way to support future </w:t>
+      </w:r>
+      <w:r>
+        <w:t>STB</w:t>
+      </w:r>
+      <w:r>
+        <w:t xml:space="preserve"> AMINO products. </w:t>
+      </w:r>
+    </w:p>
+    <w:p>
       <w:pPr>
         <w:pStyle w:val="ListParagraph"/>
         <w:numPr>
@@ -860,13 +1283,33 @@
         <w:t xml:space="preserve">When researching ways to access a database using .NET and C#, the first option we decided upon was the idea of datasets, which did not auto generate entity classes. This posed a large problem in terms of the server organization and flexibility, which is so important at this stage of implementation. </w:t>
       </w:r>
       <w:r>
-        <w:t xml:space="preserve">After creating a few methods to prove we could access the database, we decide to use the Linq to Entities framework. Some of the features we found particularly tantalizing </w:t>
-      </w:r>
-      <w:r>
-        <w:t>was the ability to use L</w:t>
-      </w:r>
-      <w:r>
-        <w:t>inq to generating SQL statements, viewing the database as an object graph, meaning that the details of the data store are hidden, and being able to update our in memory definition easily as we change the definitions at the database level.</w:t>
+        <w:t xml:space="preserve">After creating a few methods to prove we could access the database, we decide to use the </w:t>
+      </w:r>
+      <w:proofErr w:type="spellStart"/>
+      <w:r>
+        <w:t>Linq</w:t>
+      </w:r>
+      <w:proofErr w:type="spellEnd"/>
+      <w:r>
+        <w:t xml:space="preserve"> to Entities framework. Some of the features we found particularly </w:t>
+      </w:r>
+      <w:r>
+        <w:lastRenderedPageBreak/>
+        <w:t xml:space="preserve">tantalizing </w:t>
+      </w:r>
+      <w:r>
+        <w:t xml:space="preserve">was the ability to use </w:t>
+      </w:r>
+      <w:proofErr w:type="spellStart"/>
+      <w:r>
+        <w:t>L</w:t>
+      </w:r>
+      <w:r>
+        <w:t>inq</w:t>
+      </w:r>
+      <w:proofErr w:type="spellEnd"/>
+      <w:r>
+        <w:t xml:space="preserve"> to generating SQL statements, viewing the database as an object graph, meaning that the details of the data store are hidden, and being able to update our in memory definition easily as we change the definitions at the database level.</w:t>
       </w:r>
     </w:p>
     <w:p>
@@ -902,10 +1345,26 @@
         </w:numPr>
       </w:pPr>
       <w:r>
-        <w:t xml:space="preserve">Some classes are serializable, meaning that we can turn an object into a byte array and store it somewhere with little coding effort. </w:t>
-      </w:r>
-      <w:r>
-        <w:t xml:space="preserve">In a first attempt to serialize some objects, we found that the .NET serializer created unnecessarily large byte arrays. After some discussion, we decided to use Google’s open source serialization method, called Protocol Buffers. We observed that same object we had previously serialized using .NET used about half the memory when serialized under Protocol Buffers. </w:t>
+        <w:t xml:space="preserve">Some classes are </w:t>
+      </w:r>
+      <w:proofErr w:type="spellStart"/>
+      <w:r>
+        <w:t>serializable</w:t>
+      </w:r>
+      <w:proofErr w:type="spellEnd"/>
+      <w:r>
+        <w:t xml:space="preserve">, meaning that we can turn an object into a byte array and store it somewhere with little coding effort. </w:t>
+      </w:r>
+      <w:r>
+        <w:t xml:space="preserve">In a first attempt to serialize some objects, we found that the .NET </w:t>
+      </w:r>
+      <w:proofErr w:type="spellStart"/>
+      <w:r>
+        <w:t>serializer</w:t>
+      </w:r>
+      <w:proofErr w:type="spellEnd"/>
+      <w:r>
+        <w:t xml:space="preserve"> created unnecessarily large byte arrays. After some discussion, we decided to use Google’s open source serialization method, called Protocol Buffers. We observed that same object we had previously serialized using .NET used about half the memory when serialized under Protocol Buffers. </w:t>
       </w:r>
     </w:p>
     <w:p>
@@ -926,23 +1385,55 @@
     </w:p>
     <w:p>
       <w:r>
-        <w:t>TODO</w:t>
-      </w:r>
-    </w:p>
-    <w:p>
-      <w:pPr>
-        <w:pStyle w:val="Heading2"/>
-      </w:pPr>
-      <w:r>
-        <w:t>Server</w:t>
-      </w:r>
-    </w:p>
-    <w:p>
-      <w:r>
-        <w:t xml:space="preserve">In the next sprint, we will finish up the bare bones of the server so that it can be run as a service. There is work to be done in terms of messaging yet. We need to split large messages into multiple messages. This is to accommodate the UDP message passing between the APMax and STBs. We will also begin implementing the logic of checkers. After we have the logic in place, we can begin work on the artificial intelligence aspect of checkers. </w:t>
+        <w:t xml:space="preserve">The </w:t>
+      </w:r>
+      <w:proofErr w:type="spellStart"/>
+      <w:r>
+        <w:t>Gameview</w:t>
+      </w:r>
+      <w:proofErr w:type="spellEnd"/>
+      <w:r>
+        <w:t xml:space="preserve">, </w:t>
+      </w:r>
+      <w:proofErr w:type="spellStart"/>
+      <w:r>
+        <w:t>Gamemodel</w:t>
+      </w:r>
+      <w:proofErr w:type="spellEnd"/>
+      <w:r>
+        <w:t xml:space="preserve">, and </w:t>
+      </w:r>
+      <w:proofErr w:type="spellStart"/>
+      <w:r>
+        <w:t>Gamepiece</w:t>
+      </w:r>
+      <w:proofErr w:type="spellEnd"/>
+      <w:r>
+        <w:t xml:space="preserve"> need to be slightly modified to read from local resource files. Implement Unit Testing for model/ view classes.</w:t>
       </w:r>
       <w:bookmarkStart w:id="0" w:name="_GoBack"/>
       <w:bookmarkEnd w:id="0"/>
+    </w:p>
+    <w:p>
+      <w:pPr>
+        <w:pStyle w:val="Heading2"/>
+      </w:pPr>
+      <w:r>
+        <w:t>Server</w:t>
+      </w:r>
+    </w:p>
+    <w:p>
+      <w:r>
+        <w:t xml:space="preserve">In the next sprint, we will finish up the bare bones of the server so that it can be run as a service. There is work to be done in terms of messaging yet. We need to split large messages into multiple messages. This is to accommodate the UDP message passing between the </w:t>
+      </w:r>
+      <w:proofErr w:type="spellStart"/>
+      <w:r>
+        <w:t>APMax</w:t>
+      </w:r>
+      <w:proofErr w:type="spellEnd"/>
+      <w:r>
+        <w:t xml:space="preserve"> and STBs. We will also begin implementing the logic of checkers. After we have the logic in place, we can begin work on the artificial intelligence aspect of checkers. </w:t>
+      </w:r>
     </w:p>
     <w:sectPr>
       <w:pgSz w:w="12240" w:h="15840"/>
@@ -1301,6 +1792,92 @@
     </w:lvl>
   </w:abstractNum>
   <w:abstractNum w:abstractNumId="4">
+    <w:nsid w:val="57BB6284"/>
+    <w:multiLevelType w:val="multilevel"/>
+    <w:tmpl w:val="0409001F"/>
+    <w:lvl w:ilvl="0">
+      <w:start w:val="1"/>
+      <w:numFmt w:val="decimal"/>
+      <w:lvlText w:val="%1."/>
+      <w:lvlJc w:val="left"/>
+      <w:pPr>
+        <w:ind w:left="360" w:hanging="360"/>
+      </w:pPr>
+    </w:lvl>
+    <w:lvl w:ilvl="1">
+      <w:start w:val="1"/>
+      <w:numFmt w:val="decimal"/>
+      <w:lvlText w:val="%1.%2."/>
+      <w:lvlJc w:val="left"/>
+      <w:pPr>
+        <w:ind w:left="792" w:hanging="432"/>
+      </w:pPr>
+    </w:lvl>
+    <w:lvl w:ilvl="2">
+      <w:start w:val="1"/>
+      <w:numFmt w:val="decimal"/>
+      <w:lvlText w:val="%1.%2.%3."/>
+      <w:lvlJc w:val="left"/>
+      <w:pPr>
+        <w:ind w:left="1224" w:hanging="504"/>
+      </w:pPr>
+    </w:lvl>
+    <w:lvl w:ilvl="3">
+      <w:start w:val="1"/>
+      <w:numFmt w:val="decimal"/>
+      <w:lvlText w:val="%1.%2.%3.%4."/>
+      <w:lvlJc w:val="left"/>
+      <w:pPr>
+        <w:ind w:left="1728" w:hanging="648"/>
+      </w:pPr>
+    </w:lvl>
+    <w:lvl w:ilvl="4">
+      <w:start w:val="1"/>
+      <w:numFmt w:val="decimal"/>
+      <w:lvlText w:val="%1.%2.%3.%4.%5."/>
+      <w:lvlJc w:val="left"/>
+      <w:pPr>
+        <w:ind w:left="2232" w:hanging="792"/>
+      </w:pPr>
+    </w:lvl>
+    <w:lvl w:ilvl="5">
+      <w:start w:val="1"/>
+      <w:numFmt w:val="decimal"/>
+      <w:lvlText w:val="%1.%2.%3.%4.%5.%6."/>
+      <w:lvlJc w:val="left"/>
+      <w:pPr>
+        <w:ind w:left="2736" w:hanging="936"/>
+      </w:pPr>
+    </w:lvl>
+    <w:lvl w:ilvl="6">
+      <w:start w:val="1"/>
+      <w:numFmt w:val="decimal"/>
+      <w:lvlText w:val="%1.%2.%3.%4.%5.%6.%7."/>
+      <w:lvlJc w:val="left"/>
+      <w:pPr>
+        <w:ind w:left="3240" w:hanging="1080"/>
+      </w:pPr>
+    </w:lvl>
+    <w:lvl w:ilvl="7">
+      <w:start w:val="1"/>
+      <w:numFmt w:val="decimal"/>
+      <w:lvlText w:val="%1.%2.%3.%4.%5.%6.%7.%8."/>
+      <w:lvlJc w:val="left"/>
+      <w:pPr>
+        <w:ind w:left="3744" w:hanging="1224"/>
+      </w:pPr>
+    </w:lvl>
+    <w:lvl w:ilvl="8">
+      <w:start w:val="1"/>
+      <w:numFmt w:val="decimal"/>
+      <w:lvlText w:val="%1.%2.%3.%4.%5.%6.%7.%8.%9."/>
+      <w:lvlJc w:val="left"/>
+      <w:pPr>
+        <w:ind w:left="4320" w:hanging="1440"/>
+      </w:pPr>
+    </w:lvl>
+  </w:abstractNum>
+  <w:abstractNum w:abstractNumId="5">
     <w:nsid w:val="65025822"/>
     <w:multiLevelType w:val="multilevel"/>
     <w:tmpl w:val="0409001F"/>
@@ -1383,6 +1960,92 @@
       <w:lvlJc w:val="left"/>
       <w:pPr>
         <w:ind w:left="4320" w:hanging="1440"/>
+      </w:pPr>
+    </w:lvl>
+  </w:abstractNum>
+  <w:abstractNum w:abstractNumId="6">
+    <w:nsid w:val="707B5F06"/>
+    <w:multiLevelType w:val="hybridMultilevel"/>
+    <w:tmpl w:val="4A68DFFA"/>
+    <w:lvl w:ilvl="0" w:tplc="0409000F">
+      <w:start w:val="1"/>
+      <w:numFmt w:val="decimal"/>
+      <w:lvlText w:val="%1."/>
+      <w:lvlJc w:val="left"/>
+      <w:pPr>
+        <w:ind w:left="720" w:hanging="360"/>
+      </w:pPr>
+    </w:lvl>
+    <w:lvl w:ilvl="1" w:tplc="04090019">
+      <w:start w:val="1"/>
+      <w:numFmt w:val="lowerLetter"/>
+      <w:lvlText w:val="%2."/>
+      <w:lvlJc w:val="left"/>
+      <w:pPr>
+        <w:ind w:left="1440" w:hanging="360"/>
+      </w:pPr>
+    </w:lvl>
+    <w:lvl w:ilvl="2" w:tplc="0409001B" w:tentative="1">
+      <w:start w:val="1"/>
+      <w:numFmt w:val="lowerRoman"/>
+      <w:lvlText w:val="%3."/>
+      <w:lvlJc w:val="right"/>
+      <w:pPr>
+        <w:ind w:left="2160" w:hanging="180"/>
+      </w:pPr>
+    </w:lvl>
+    <w:lvl w:ilvl="3" w:tplc="0409000F" w:tentative="1">
+      <w:start w:val="1"/>
+      <w:numFmt w:val="decimal"/>
+      <w:lvlText w:val="%4."/>
+      <w:lvlJc w:val="left"/>
+      <w:pPr>
+        <w:ind w:left="2880" w:hanging="360"/>
+      </w:pPr>
+    </w:lvl>
+    <w:lvl w:ilvl="4" w:tplc="04090019" w:tentative="1">
+      <w:start w:val="1"/>
+      <w:numFmt w:val="lowerLetter"/>
+      <w:lvlText w:val="%5."/>
+      <w:lvlJc w:val="left"/>
+      <w:pPr>
+        <w:ind w:left="3600" w:hanging="360"/>
+      </w:pPr>
+    </w:lvl>
+    <w:lvl w:ilvl="5" w:tplc="0409001B" w:tentative="1">
+      <w:start w:val="1"/>
+      <w:numFmt w:val="lowerRoman"/>
+      <w:lvlText w:val="%6."/>
+      <w:lvlJc w:val="right"/>
+      <w:pPr>
+        <w:ind w:left="4320" w:hanging="180"/>
+      </w:pPr>
+    </w:lvl>
+    <w:lvl w:ilvl="6" w:tplc="0409000F" w:tentative="1">
+      <w:start w:val="1"/>
+      <w:numFmt w:val="decimal"/>
+      <w:lvlText w:val="%7."/>
+      <w:lvlJc w:val="left"/>
+      <w:pPr>
+        <w:ind w:left="5040" w:hanging="360"/>
+      </w:pPr>
+    </w:lvl>
+    <w:lvl w:ilvl="7" w:tplc="04090019" w:tentative="1">
+      <w:start w:val="1"/>
+      <w:numFmt w:val="lowerLetter"/>
+      <w:lvlText w:val="%8."/>
+      <w:lvlJc w:val="left"/>
+      <w:pPr>
+        <w:ind w:left="5760" w:hanging="360"/>
+      </w:pPr>
+    </w:lvl>
+    <w:lvl w:ilvl="8" w:tplc="0409001B" w:tentative="1">
+      <w:start w:val="1"/>
+      <w:numFmt w:val="lowerRoman"/>
+      <w:lvlText w:val="%9."/>
+      <w:lvlJc w:val="right"/>
+      <w:pPr>
+        <w:ind w:left="6480" w:hanging="180"/>
       </w:pPr>
     </w:lvl>
   </w:abstractNum>
@@ -1396,10 +2059,16 @@
     <w:abstractNumId w:val="0"/>
   </w:num>
   <w:num w:numId="4">
-    <w:abstractNumId w:val="4"/>
+    <w:abstractNumId w:val="5"/>
   </w:num>
   <w:num w:numId="5">
     <w:abstractNumId w:val="2"/>
+  </w:num>
+  <w:num w:numId="6">
+    <w:abstractNumId w:val="6"/>
+  </w:num>
+  <w:num w:numId="7">
+    <w:abstractNumId w:val="4"/>
   </w:num>
 </w:numbering>
 </file>
@@ -2399,4 +3068,16 @@
   <a:objectDefaults/>
   <a:extraClrSchemeLst/>
 </a:theme>
+</file>
+
+<file path=customXml/item1.xml><?xml version="1.0" encoding="utf-8"?>
+<b:Sources xmlns:b="http://schemas.openxmlformats.org/officeDocument/2006/bibliography" xmlns="http://schemas.openxmlformats.org/officeDocument/2006/bibliography" SelectedStyle="\APA.XSL" StyleName="APA"/>
+</file>
+
+<file path=customXml/itemProps1.xml><?xml version="1.0" encoding="utf-8"?>
+<ds:datastoreItem xmlns:ds="http://schemas.openxmlformats.org/officeDocument/2006/customXml" ds:itemID="{AA5A8AD9-A6CA-482B-ADD0-D7AB6A85D69A}">
+  <ds:schemaRefs>
+    <ds:schemaRef ds:uri="http://schemas.openxmlformats.org/officeDocument/2006/bibliography"/>
+  </ds:schemaRefs>
+</ds:datastoreItem>
 </file>
</xml_diff>